<commit_message>
Fix incidence errors in Table 1 and update author info
- Corrected 4 incidence values in Table 1 (2019: 59.8, 2021: 16.8,
  2022: 36.8, 2025: 60.7 per 100,000)
- Updated manuscript with author name, email, and GitHub URL
</commit_message>
<xml_diff>
--- a/Bangladesh_Dengue_Manuscript.docx
+++ b/Bangladesh_Dengue_Manuscript.docx
@@ -818,7 +818,7 @@
                 <w:rFonts w:ascii="Times New Roman" w:hAnsi="Times New Roman"/>
                 <w:sz w:val="20"/>
               </w:rPr>
-              <w:t>60.5</w:t>
+              <w:t>59.8</w:t>
             </w:r>
           </w:p>
         </w:tc>
@@ -934,7 +934,7 @@
                 <w:rFonts w:ascii="Times New Roman" w:hAnsi="Times New Roman"/>
                 <w:sz w:val="20"/>
               </w:rPr>
-              <w:t>16.9</w:t>
+              <w:t>16.8</w:t>
             </w:r>
           </w:p>
         </w:tc>
@@ -992,7 +992,7 @@
                 <w:rFonts w:ascii="Times New Roman" w:hAnsi="Times New Roman"/>
                 <w:sz w:val="20"/>
               </w:rPr>
-              <w:t>37.3</w:t>
+              <w:t>36.8</w:t>
             </w:r>
           </w:p>
         </w:tc>
@@ -1166,7 +1166,7 @@
                 <w:rFonts w:ascii="Times New Roman" w:hAnsi="Times New Roman"/>
                 <w:sz w:val="20"/>
               </w:rPr>
-              <w:t>60.8</w:t>
+              <w:t>60.7</w:t>
             </w:r>
           </w:p>
         </w:tc>

</xml_diff>

<commit_message>
Add co-author Watan Rahman (Institute of Science and Technology, Dhaka)
Update author block, affiliations, correspondence, and citation in README.
</commit_message>
<xml_diff>
--- a/Bangladesh_Dengue_Manuscript.docx
+++ b/Bangladesh_Dengue_Manuscript.docx
@@ -26,7 +26,7 @@
           <w:rFonts w:ascii="Times New Roman" w:hAnsi="Times New Roman"/>
           <w:sz w:val="24"/>
         </w:rPr>
-        <w:t>Khalilur Rahman Ridoy Khan</w:t>
+        <w:t>Khalilur Rahman Ridoy Khan¹, Watan Rahman²</w:t>
       </w:r>
     </w:p>
     <w:p>
@@ -40,7 +40,9 @@
           <w:i/>
           <w:sz w:val="22"/>
         </w:rPr>
-        <w:t>Independent Researcher, Dhaka, Bangladesh</w:t>
+        <w:t>¹Independent Researcher, Dhaka, Bangladesh</w:t>
+        <w:br/>
+        <w:t>²Institute of Science and Technology, Dhaka, Bangladesh</w:t>
       </w:r>
     </w:p>
     <w:p>
@@ -409,7 +411,7 @@
           <w:i w:val="0"/>
           <w:sz w:val="24"/>
         </w:rPr>
-        <w:t>Dashboard data are rendered as interactive Highcharts visualisations embedded within the webpage as inline JavaScript data arrays. We developed an automated Python script (Python 3.14; libraries: requests, re, pandas) to perform an HTTP GET request to the dashboard URL, parse all Highcharts chart objects from the page source using regular expressions, and extract the associated categories (time periods, division names) and series data (case counts). Six structured datasets were generated: annual national cases (2018–2026); monthly national cases (2023–2025); weekly national cases (2023–2025); daily national cases (January–June 2026); division-level cumulative cases and deaths (2026 year-to-date); and weekly cases by division (2026, weeks 1–22). All data and analysis code are publicly available at https://github.com/khalilurrrahmanridoykhan/bangladesh-dengue-2018-2025.</w:t>
+        <w:t>Dashboard data are rendered as interactive Highcharts visualisations embedded within the webpage as inline JavaScript data arrays. We developed an automated Python script (Python 3.14; libraries: requests, re, pandas) to perform an HTTP GET request to the dashboard URL, parse all Highcharts chart objects from the page source using regular expressions, and extract the associated categories (time periods, division names) and series data (case counts). Six structured datasets were generated: annual national cases (2018–2026); monthly national cases (2023–2025); weekly national cases (2023–2025); daily national cases (January–June 2026); division-level cumulative cases and deaths (2026 year-to-date); and weekly cases by division (2026, weeks 1–22). All data and analysis code are publicly available at [GitHub repository URL].</w:t>
       </w:r>
     </w:p>
     <w:p>
@@ -3574,7 +3576,7 @@
           <w:i w:val="0"/>
           <w:sz w:val="24"/>
         </w:rPr>
-        <w:t>The author declares no competing interests.</w:t>
+        <w:t>The authors declare no competing interests.</w:t>
       </w:r>
     </w:p>
     <w:p>

</xml_diff>